<commit_message>
Align NQ support forms with official layout
</commit_message>
<xml_diff>
--- a/templates_word/ho_tro_nq32.docx
+++ b/templates_word/ho_tro_nq32.docx
@@ -100,7 +100,10 @@
     </w:p>
     <w:p>
       <w:pPr>
-        <w:spacing w:before="0" w:after="120" w:line="240" w:lineRule="auto"/>
+        <w:tabs>
+          <w:tab w:pos="9780" w:val="right" w:leader="dot"/>
+        </w:tabs>
+        <w:spacing w:before="0" w:after="160" w:line="240" w:lineRule="auto"/>
       </w:pPr>
       <w:r>
         <w:rPr>
@@ -127,12 +130,15 @@
           <w:i w:val="0"/>
           <w:sz w:val="24"/>
         </w:rPr>
-        <w:t xml:space="preserve"> ....................................................</w:t>
+        <w:tab/>
       </w:r>
     </w:p>
     <w:p>
       <w:pPr>
-        <w:spacing w:before="0" w:after="120" w:line="240" w:lineRule="auto"/>
+        <w:tabs>
+          <w:tab w:pos="9780" w:val="right" w:leader="dot"/>
+        </w:tabs>
+        <w:spacing w:before="0" w:after="160" w:line="240" w:lineRule="auto"/>
       </w:pPr>
       <w:r>
         <w:rPr>
@@ -159,12 +165,12 @@
           <w:i w:val="0"/>
           <w:sz w:val="24"/>
         </w:rPr>
-        <w:t xml:space="preserve"> ....................................................</w:t>
+        <w:tab/>
       </w:r>
     </w:p>
     <w:p>
       <w:pPr>
-        <w:spacing w:before="0" w:after="120" w:line="240" w:lineRule="auto"/>
+        <w:spacing w:before="0" w:after="160" w:line="240" w:lineRule="auto"/>
       </w:pPr>
       <w:r>
         <w:rPr>
@@ -223,7 +229,10 @@
     </w:p>
     <w:p>
       <w:pPr>
-        <w:spacing w:before="0" w:after="120" w:line="240" w:lineRule="auto"/>
+        <w:tabs>
+          <w:tab w:pos="9780" w:val="right" w:leader="dot"/>
+        </w:tabs>
+        <w:spacing w:before="0" w:after="160" w:line="240" w:lineRule="auto"/>
       </w:pPr>
       <w:r>
         <w:rPr>
@@ -250,12 +259,15 @@
           <w:i w:val="0"/>
           <w:sz w:val="24"/>
         </w:rPr>
-        <w:t xml:space="preserve"> ..........................................</w:t>
+        <w:tab/>
       </w:r>
     </w:p>
     <w:p>
       <w:pPr>
-        <w:spacing w:before="0" w:after="120" w:line="240" w:lineRule="auto"/>
+        <w:tabs>
+          <w:tab w:pos="9780" w:val="right" w:leader="dot"/>
+        </w:tabs>
+        <w:spacing w:before="0" w:after="160" w:line="240" w:lineRule="auto"/>
       </w:pPr>
       <w:r>
         <w:rPr>
@@ -282,12 +294,15 @@
           <w:i w:val="0"/>
           <w:sz w:val="24"/>
         </w:rPr>
-        <w:t xml:space="preserve"> ...........................................</w:t>
+        <w:tab/>
       </w:r>
     </w:p>
     <w:p>
       <w:pPr>
-        <w:spacing w:before="0" w:after="120" w:line="240" w:lineRule="auto"/>
+        <w:tabs>
+          <w:tab w:pos="9780" w:val="right" w:leader="dot"/>
+        </w:tabs>
+        <w:spacing w:before="0" w:after="160" w:line="240" w:lineRule="auto"/>
       </w:pPr>
       <w:r>
         <w:rPr>
@@ -314,12 +329,15 @@
           <w:i w:val="0"/>
           <w:sz w:val="24"/>
         </w:rPr>
-        <w:t xml:space="preserve"> .......................................................</w:t>
+        <w:tab/>
       </w:r>
     </w:p>
     <w:p>
       <w:pPr>
-        <w:spacing w:before="0" w:after="120" w:line="240" w:lineRule="auto"/>
+        <w:tabs>
+          <w:tab w:pos="9780" w:val="right" w:leader="dot"/>
+        </w:tabs>
+        <w:spacing w:before="0" w:after="160" w:line="240" w:lineRule="auto"/>
       </w:pPr>
       <w:r>
         <w:rPr>
@@ -346,12 +364,15 @@
           <w:i w:val="0"/>
           <w:sz w:val="24"/>
         </w:rPr>
-        <w:t xml:space="preserve"> ........................................................</w:t>
+        <w:tab/>
       </w:r>
     </w:p>
     <w:p>
       <w:pPr>
-        <w:spacing w:before="0" w:after="120" w:line="240" w:lineRule="auto"/>
+        <w:tabs>
+          <w:tab w:pos="9780" w:val="right" w:leader="dot"/>
+        </w:tabs>
+        <w:spacing w:before="0" w:after="160" w:line="240" w:lineRule="auto"/>
       </w:pPr>
       <w:r>
         <w:rPr>
@@ -378,7 +399,7 @@
           <w:i w:val="0"/>
           <w:sz w:val="24"/>
         </w:rPr>
-        <w:t xml:space="preserve"> ....................................................</w:t>
+        <w:tab/>
       </w:r>
     </w:p>
     <w:p>
@@ -398,7 +419,10 @@
     </w:p>
     <w:p>
       <w:pPr>
-        <w:spacing w:before="0" w:after="40" w:line="240" w:lineRule="auto"/>
+        <w:tabs>
+          <w:tab w:pos="8929" w:val="right"/>
+        </w:tabs>
+        <w:spacing w:before="0" w:after="60" w:line="240" w:lineRule="auto"/>
         <w:ind w:left="822"/>
       </w:pPr>
       <w:r>
@@ -417,12 +441,13 @@
           <w:i w:val="0"/>
           <w:sz w:val="26"/>
         </w:rPr>
-        <w:t xml:space="preserve">  {{support_two_children_check}}</w:t>
+        <w:tab/>
+        <w:t>{{support_two_children_check}}</w:t>
       </w:r>
     </w:p>
     <w:p>
       <w:pPr>
-        <w:spacing w:before="0" w:after="40" w:line="240" w:lineRule="auto"/>
+        <w:spacing w:before="0" w:after="60" w:line="240" w:lineRule="auto"/>
         <w:ind w:left="822"/>
       </w:pPr>
       <w:r>
@@ -437,7 +462,10 @@
     </w:p>
     <w:p>
       <w:pPr>
-        <w:spacing w:before="0" w:after="40" w:line="240" w:lineRule="auto"/>
+        <w:tabs>
+          <w:tab w:pos="8504" w:val="right"/>
+        </w:tabs>
+        <w:spacing w:before="0" w:after="60" w:line="240" w:lineRule="auto"/>
         <w:ind w:left="1247"/>
       </w:pPr>
       <w:r>
@@ -456,12 +484,16 @@
           <w:i w:val="0"/>
           <w:sz w:val="26"/>
         </w:rPr>
-        <w:t xml:space="preserve">  {{support_poor_check}}</w:t>
+        <w:tab/>
+        <w:t>{{support_poor_check}}</w:t>
       </w:r>
     </w:p>
     <w:p>
       <w:pPr>
-        <w:spacing w:before="0" w:after="40" w:line="240" w:lineRule="auto"/>
+        <w:tabs>
+          <w:tab w:pos="8504" w:val="right"/>
+        </w:tabs>
+        <w:spacing w:before="0" w:after="60" w:line="240" w:lineRule="auto"/>
         <w:ind w:left="1247"/>
       </w:pPr>
       <w:r>
@@ -480,12 +512,16 @@
           <w:i w:val="0"/>
           <w:sz w:val="26"/>
         </w:rPr>
-        <w:t xml:space="preserve">  {{support_near_poor_check}}</w:t>
+        <w:tab/>
+        <w:t>{{support_near_poor_check}}</w:t>
       </w:r>
     </w:p>
     <w:p>
       <w:pPr>
-        <w:spacing w:before="0" w:after="40" w:line="240" w:lineRule="auto"/>
+        <w:tabs>
+          <w:tab w:pos="8504" w:val="right"/>
+        </w:tabs>
+        <w:spacing w:before="0" w:after="60" w:line="240" w:lineRule="auto"/>
         <w:ind w:left="1247"/>
       </w:pPr>
       <w:r>
@@ -504,12 +540,16 @@
           <w:i w:val="0"/>
           <w:sz w:val="26"/>
         </w:rPr>
-        <w:t xml:space="preserve">  {{support_social_check}}</w:t>
+        <w:tab/>
+        <w:t>{{support_social_check}}</w:t>
       </w:r>
     </w:p>
     <w:p>
       <w:pPr>
-        <w:spacing w:before="0" w:after="40" w:line="240" w:lineRule="auto"/>
+        <w:tabs>
+          <w:tab w:pos="8504" w:val="right"/>
+        </w:tabs>
+        <w:spacing w:before="0" w:after="60" w:line="240" w:lineRule="auto"/>
         <w:ind w:left="1247"/>
       </w:pPr>
       <w:r>
@@ -528,7 +568,8 @@
           <w:i w:val="0"/>
           <w:sz w:val="26"/>
         </w:rPr>
-        <w:t xml:space="preserve">  {{support_island_check}}</w:t>
+        <w:tab/>
+        <w:t>{{support_island_check}}</w:t>
       </w:r>
     </w:p>
     <w:p>
@@ -605,7 +646,7 @@
                 <w:i/>
                 <w:sz w:val="24"/>
               </w:rPr>
-              <w:t>Ngày {{declaration_day}} tháng {{declaration_month}} năm {{declaration_year}}</w:t>
+              <w:t>Ngày..... tháng.... năm 20.....</w:t>
             </w:r>
           </w:p>
           <w:p>
@@ -638,41 +679,12 @@
               <w:t>(ký và ghi rõ họ, tên)</w:t>
             </w:r>
           </w:p>
-          <w:p>
-            <w:pPr>
-              <w:spacing w:before="0" w:after="20" w:line="240" w:lineRule="auto"/>
-              <w:jc w:val="center"/>
-            </w:pPr>
-            <w:r>
-              <w:rPr>
-                <w:rFonts w:ascii="Times New Roman" w:hAnsi="Times New Roman" w:eastAsia="Times New Roman"/>
-                <w:b w:val="0"/>
-                <w:i w:val="0"/>
-                <w:sz w:val="24"/>
-              </w:rPr>
-            </w:r>
-          </w:p>
-          <w:p>
-            <w:pPr>
-              <w:spacing w:before="0" w:after="20" w:line="240" w:lineRule="auto"/>
-              <w:jc w:val="center"/>
-            </w:pPr>
-            <w:r>
-              <w:rPr>
-                <w:rFonts w:ascii="Times New Roman" w:hAnsi="Times New Roman" w:eastAsia="Times New Roman"/>
-                <w:b/>
-                <w:i w:val="0"/>
-                <w:sz w:val="24"/>
-              </w:rPr>
-              <w:t>{{full_name}}</w:t>
-            </w:r>
-          </w:p>
         </w:tc>
       </w:tr>
     </w:tbl>
     <w:sectPr>
       <w:pgSz w:w="11906" w:h="16838"/>
-      <w:pgMar w:top="822" w:right="992" w:bottom="765" w:left="992" w:header="720" w:footer="720" w:gutter="0"/>
+      <w:pgMar w:top="1134" w:right="992" w:bottom="850" w:left="992" w:header="720" w:footer="720" w:gutter="0"/>
       <w:cols w:space="720"/>
       <w:docGrid w:linePitch="360"/>
     </w:sectPr>

</xml_diff>